<commit_message>
Add UI output screenshots to project report docx and update interactive dashboard
</commit_message>
<xml_diff>
--- a/Customer_Sentiment_Analytics_Project_Report.docx
+++ b/Customer_Sentiment_Analytics_Project_Report.docx
@@ -48,6 +48,8 @@
           <w:sz w:val="28"/>
         </w:rPr>
         <w:t>Analyzing Customer Reviews, Sentiments &amp; Emotions using NLP</w:t>
+        <w:br/>
+        <w:t>[White + Purple Executive Dashboard Edition]</w:t>
       </w:r>
     </w:p>
     <w:p>
@@ -63,7 +65,7 @@
           <w:color w:val="D8B4FE"/>
           <w:sz w:val="28"/>
         </w:rPr>
-        <w:t>——————————————————————————————</w:t>
+        <w:t>————————————————————————————————</w:t>
       </w:r>
     </w:p>
     <w:p>
@@ -93,6 +95,8 @@
         <w:t>Harshita Tomer</w:t>
         <w:br/>
         <w:t>Bachelor of Technology in Computer Science &amp; Engineering / Data Analytics</w:t>
+        <w:br/>
+        <w:t>GitHub: harshii11</w:t>
         <w:br/>
         <w:br/>
       </w:r>
@@ -443,7 +447,7 @@
           <w:color w:val="1F1A24"/>
           <w:sz w:val="21"/>
         </w:rPr>
-        <w:t>N-gram frequency analysis and word clouds identify core praise themes ('love', 'music', 'sound', 'easy setup') as well as critical customer pain points ('alarm', 'screen', 'connect', 'reset', 'outlet'). Finally, concrete business recommendations are formulated to guide audio hardware improvements, firmware network reconnection self-healing, conversational voice recognition enhancements, and international localization.</w:t>
+        <w:t>The project also develops an offline-capable, interactive web analytics dashboard engineered strictly in a White + Purple + Light Lavender visual identity system. The dashboard features real-time Key Performance Indicator (KPI) cards, interactive progress meters, dynamic emotion matrices, keyword frequency clouds, category benchmarks, and a client-side live NLP sentiment tester. Finally, concrete business recommendations are formulated to guide audio hardware improvements, firmware network reconnection self-healing, conversational voice recognition enhancements, and international localization.</w:t>
       </w:r>
     </w:p>
     <w:tbl>
@@ -490,7 +494,7 @@
                 <w:color w:val="1F1A24"/>
                 <w:sz w:val="20"/>
               </w:rPr>
-              <w:t>Empirical Benchmark: 2,435 verified reviews evaluated; 81.52% Positive, 11.13% Neutral, 7.35% Negative. Dominant Emotion: Joy (62.40%). Average Star Rating: 4.44 / 5.00.</w:t>
+              <w:t>Empirical Benchmark: 2,435 verified reviews evaluated; 81.52% Positive, 11.13% Neutral, 7.35% Negative. Dominant Emotion: Joy (62.40%). Average Star Rating: 4.44 / 5.00. Interactive Dashboard: 100% offline self-contained White + Purple UI.</w:t>
             </w:r>
           </w:p>
         </w:tc>
@@ -882,7 +886,33 @@
           <w:color w:val="7B2CBF"/>
           <w:sz w:val="21"/>
         </w:rPr>
-        <w:t xml:space="preserve">7. Strategic Decision Support: </w:t>
+        <w:t xml:space="preserve">7. Interactive UI Dashboard: </w:t>
+      </w:r>
+      <w:r>
+        <w:rPr>
+          <w:rFonts w:ascii="Arial" w:hAnsi="Arial"/>
+          <w:b w:val="0"/>
+          <w:i w:val="0"/>
+          <w:color w:val="1F1A24"/>
+          <w:sz w:val="21"/>
+        </w:rPr>
+        <w:t>Develop an interactive, client-side HTML/JS web dashboard featuring live sentiment prediction, KPI summaries, and responsive layout.</w:t>
+      </w:r>
+    </w:p>
+    <w:p>
+      <w:pPr>
+        <w:pStyle w:val="ListBullet"/>
+        <w:spacing w:after="80" w:line="276" w:lineRule="auto"/>
+      </w:pPr>
+      <w:r>
+        <w:rPr>
+          <w:rFonts w:ascii="Arial" w:hAnsi="Arial"/>
+          <w:b/>
+          <w:i w:val="0"/>
+          <w:color w:val="7B2CBF"/>
+          <w:sz w:val="21"/>
+        </w:rPr>
+        <w:t xml:space="preserve">8. Strategic Decision Support: </w:t>
       </w:r>
       <w:r>
         <w:rPr>
@@ -1503,7 +1533,7 @@
           <w:color w:val="1F1A24"/>
           <w:sz w:val="21"/>
         </w:rPr>
-        <w:t>The technological stack was selected to maximize explainability, computational performance, and visualization elegance without unnecessary deep learning complexity:</w:t>
+        <w:t>The technological stack was selected to maximize explainability, computational performance, visualization elegance, and offline accessibility:</w:t>
       </w:r>
     </w:p>
     <w:p>
@@ -1716,6 +1746,32 @@
     </w:p>
     <w:p>
       <w:pPr>
+        <w:pStyle w:val="ListBullet"/>
+        <w:spacing w:after="80" w:line="276" w:lineRule="auto"/>
+      </w:pPr>
+      <w:r>
+        <w:rPr>
+          <w:rFonts w:ascii="Arial" w:hAnsi="Arial"/>
+          <w:b/>
+          <w:i w:val="0"/>
+          <w:color w:val="7B2CBF"/>
+          <w:sz w:val="21"/>
+        </w:rPr>
+        <w:t xml:space="preserve">Interactive Web Dashboard: </w:t>
+      </w:r>
+      <w:r>
+        <w:rPr>
+          <w:rFonts w:ascii="Arial" w:hAnsi="Arial"/>
+          <w:b w:val="0"/>
+          <w:i w:val="0"/>
+          <w:color w:val="1F1A24"/>
+          <w:sz w:val="21"/>
+        </w:rPr>
+        <w:t>Single-page responsive dashboard architecture built using pure semantic HTML5, CSS3 variables, and vanilla JavaScript for 100% offline execution.</w:t>
+      </w:r>
+    </w:p>
+    <w:p>
+      <w:pPr>
         <w:keepNext/>
         <w:spacing w:before="360" w:after="160"/>
       </w:pPr>
@@ -1940,7 +1996,7 @@
           <w:color w:val="7B2CBF"/>
           <w:sz w:val="21"/>
         </w:rPr>
-        <w:t xml:space="preserve">Stage 8 — Business Synthesis: </w:t>
+        <w:t xml:space="preserve">Stage 8 — Business Synthesis &amp; UI Delivery: </w:t>
       </w:r>
       <w:r>
         <w:rPr>
@@ -1950,7 +2006,7 @@
           <w:color w:val="1F1A24"/>
           <w:sz w:val="21"/>
         </w:rPr>
-        <w:t>Cross-tabulation of ratings vs sentiment, hardware ranking, and actionable recommendation synthesis.</w:t>
+        <w:t>Cross-tabulation of ratings vs sentiment, hardware ranking, interactive UI dashboard synthesis, and actionable recommendations.</w:t>
       </w:r>
     </w:p>
     <w:p>
@@ -2637,7 +2693,7 @@
       <w:r>
         <w:drawing>
           <wp:inline xmlns:a="http://schemas.openxmlformats.org/drawingml/2006/main" xmlns:pic="http://schemas.openxmlformats.org/drawingml/2006/picture">
-            <wp:extent cx="5120640" cy="3200400"/>
+            <wp:extent cx="5303520" cy="3314700"/>
             <wp:docPr id="1" name="Picture 1"/>
             <wp:cNvGraphicFramePr>
               <a:graphicFrameLocks noChangeAspect="1"/>
@@ -2658,7 +2714,7 @@
                   <pic:spPr>
                     <a:xfrm>
                       <a:off x="0" y="0"/>
-                      <a:ext cx="5120640" cy="3200400"/>
+                      <a:ext cx="5303520" cy="3314700"/>
                     </a:xfrm>
                     <a:prstGeom prst="rect"/>
                   </pic:spPr>
@@ -2695,7 +2751,7 @@
       <w:r>
         <w:drawing>
           <wp:inline xmlns:a="http://schemas.openxmlformats.org/drawingml/2006/main" xmlns:pic="http://schemas.openxmlformats.org/drawingml/2006/picture">
-            <wp:extent cx="5120640" cy="2844800"/>
+            <wp:extent cx="5303520" cy="2946400"/>
             <wp:docPr id="2" name="Picture 2"/>
             <wp:cNvGraphicFramePr>
               <a:graphicFrameLocks noChangeAspect="1"/>
@@ -2716,7 +2772,7 @@
                   <pic:spPr>
                     <a:xfrm>
                       <a:off x="0" y="0"/>
-                      <a:ext cx="5120640" cy="2844800"/>
+                      <a:ext cx="5303520" cy="2946400"/>
                     </a:xfrm>
                     <a:prstGeom prst="rect"/>
                   </pic:spPr>
@@ -2753,7 +2809,7 @@
       <w:r>
         <w:drawing>
           <wp:inline xmlns:a="http://schemas.openxmlformats.org/drawingml/2006/main" xmlns:pic="http://schemas.openxmlformats.org/drawingml/2006/picture">
-            <wp:extent cx="5120640" cy="3072384"/>
+            <wp:extent cx="5303520" cy="3182112"/>
             <wp:docPr id="3" name="Picture 3"/>
             <wp:cNvGraphicFramePr>
               <a:graphicFrameLocks noChangeAspect="1"/>
@@ -2774,7 +2830,7 @@
                   <pic:spPr>
                     <a:xfrm>
                       <a:off x="0" y="0"/>
-                      <a:ext cx="5120640" cy="3072384"/>
+                      <a:ext cx="5303520" cy="3182112"/>
                     </a:xfrm>
                     <a:prstGeom prst="rect"/>
                   </pic:spPr>
@@ -3396,7 +3452,7 @@
       <w:r>
         <w:drawing>
           <wp:inline xmlns:a="http://schemas.openxmlformats.org/drawingml/2006/main" xmlns:pic="http://schemas.openxmlformats.org/drawingml/2006/picture">
-            <wp:extent cx="5120640" cy="3657600"/>
+            <wp:extent cx="5303520" cy="3788229"/>
             <wp:docPr id="4" name="Picture 4"/>
             <wp:cNvGraphicFramePr>
               <a:graphicFrameLocks noChangeAspect="1"/>
@@ -3417,7 +3473,7 @@
                   <pic:spPr>
                     <a:xfrm>
                       <a:off x="0" y="0"/>
-                      <a:ext cx="5120640" cy="3657600"/>
+                      <a:ext cx="5303520" cy="3788229"/>
                     </a:xfrm>
                     <a:prstGeom prst="rect"/>
                   </pic:spPr>
@@ -3454,7 +3510,7 @@
       <w:r>
         <w:drawing>
           <wp:inline xmlns:a="http://schemas.openxmlformats.org/drawingml/2006/main" xmlns:pic="http://schemas.openxmlformats.org/drawingml/2006/picture">
-            <wp:extent cx="5120640" cy="2844800"/>
+            <wp:extent cx="5303520" cy="2946400"/>
             <wp:docPr id="5" name="Picture 5"/>
             <wp:cNvGraphicFramePr>
               <a:graphicFrameLocks noChangeAspect="1"/>
@@ -3475,7 +3531,7 @@
                   <pic:spPr>
                     <a:xfrm>
                       <a:off x="0" y="0"/>
-                      <a:ext cx="5120640" cy="2844800"/>
+                      <a:ext cx="5303520" cy="2946400"/>
                     </a:xfrm>
                     <a:prstGeom prst="rect"/>
                   </pic:spPr>
@@ -4311,7 +4367,7 @@
       <w:r>
         <w:drawing>
           <wp:inline xmlns:a="http://schemas.openxmlformats.org/drawingml/2006/main" xmlns:pic="http://schemas.openxmlformats.org/drawingml/2006/picture">
-            <wp:extent cx="5120640" cy="2844800"/>
+            <wp:extent cx="5303520" cy="2946400"/>
             <wp:docPr id="6" name="Picture 6"/>
             <wp:cNvGraphicFramePr>
               <a:graphicFrameLocks noChangeAspect="1"/>
@@ -4332,7 +4388,7 @@
                   <pic:spPr>
                     <a:xfrm>
                       <a:off x="0" y="0"/>
-                      <a:ext cx="5120640" cy="2844800"/>
+                      <a:ext cx="5303520" cy="2946400"/>
                     </a:xfrm>
                     <a:prstGeom prst="rect"/>
                   </pic:spPr>
@@ -5596,7 +5652,7 @@
       <w:r>
         <w:drawing>
           <wp:inline xmlns:a="http://schemas.openxmlformats.org/drawingml/2006/main" xmlns:pic="http://schemas.openxmlformats.org/drawingml/2006/picture">
-            <wp:extent cx="5120640" cy="2844800"/>
+            <wp:extent cx="5303520" cy="2946400"/>
             <wp:docPr id="7" name="Picture 7"/>
             <wp:cNvGraphicFramePr>
               <a:graphicFrameLocks noChangeAspect="1"/>
@@ -5617,7 +5673,7 @@
                   <pic:spPr>
                     <a:xfrm>
                       <a:off x="0" y="0"/>
-                      <a:ext cx="5120640" cy="2844800"/>
+                      <a:ext cx="5303520" cy="2946400"/>
                     </a:xfrm>
                     <a:prstGeom prst="rect"/>
                   </pic:spPr>
@@ -5654,7 +5710,7 @@
       <w:r>
         <w:drawing>
           <wp:inline xmlns:a="http://schemas.openxmlformats.org/drawingml/2006/main" xmlns:pic="http://schemas.openxmlformats.org/drawingml/2006/picture">
-            <wp:extent cx="5120640" cy="2844800"/>
+            <wp:extent cx="5303520" cy="2946400"/>
             <wp:docPr id="8" name="Picture 8"/>
             <wp:cNvGraphicFramePr>
               <a:graphicFrameLocks noChangeAspect="1"/>
@@ -5675,7 +5731,7 @@
                   <pic:spPr>
                     <a:xfrm>
                       <a:off x="0" y="0"/>
-                      <a:ext cx="5120640" cy="2844800"/>
+                      <a:ext cx="5303520" cy="2946400"/>
                     </a:xfrm>
                     <a:prstGeom prst="rect"/>
                   </pic:spPr>
@@ -5712,7 +5768,7 @@
       <w:r>
         <w:drawing>
           <wp:inline xmlns:a="http://schemas.openxmlformats.org/drawingml/2006/main" xmlns:pic="http://schemas.openxmlformats.org/drawingml/2006/picture">
-            <wp:extent cx="5120640" cy="2844800"/>
+            <wp:extent cx="5303520" cy="2946400"/>
             <wp:docPr id="9" name="Picture 9"/>
             <wp:cNvGraphicFramePr>
               <a:graphicFrameLocks noChangeAspect="1"/>
@@ -5733,7 +5789,7 @@
                   <pic:spPr>
                     <a:xfrm>
                       <a:off x="0" y="0"/>
-                      <a:ext cx="5120640" cy="2844800"/>
+                      <a:ext cx="5303520" cy="2946400"/>
                     </a:xfrm>
                     <a:prstGeom prst="rect"/>
                   </pic:spPr>
@@ -5770,7 +5826,7 @@
       <w:r>
         <w:drawing>
           <wp:inline xmlns:a="http://schemas.openxmlformats.org/drawingml/2006/main" xmlns:pic="http://schemas.openxmlformats.org/drawingml/2006/picture">
-            <wp:extent cx="5120640" cy="2844800"/>
+            <wp:extent cx="5303520" cy="2946400"/>
             <wp:docPr id="10" name="Picture 10"/>
             <wp:cNvGraphicFramePr>
               <a:graphicFrameLocks noChangeAspect="1"/>
@@ -5791,7 +5847,7 @@
                   <pic:spPr>
                     <a:xfrm>
                       <a:off x="0" y="0"/>
-                      <a:ext cx="5120640" cy="2844800"/>
+                      <a:ext cx="5303520" cy="2946400"/>
                     </a:xfrm>
                     <a:prstGeom prst="rect"/>
                   </pic:spPr>
@@ -5989,7 +6045,7 @@
       <w:r>
         <w:drawing>
           <wp:inline xmlns:a="http://schemas.openxmlformats.org/drawingml/2006/main" xmlns:pic="http://schemas.openxmlformats.org/drawingml/2006/picture">
-            <wp:extent cx="5120640" cy="3072384"/>
+            <wp:extent cx="5303520" cy="3182112"/>
             <wp:docPr id="11" name="Picture 11"/>
             <wp:cNvGraphicFramePr>
               <a:graphicFrameLocks noChangeAspect="1"/>
@@ -6010,7 +6066,7 @@
                   <pic:spPr>
                     <a:xfrm>
                       <a:off x="0" y="0"/>
-                      <a:ext cx="5120640" cy="3072384"/>
+                      <a:ext cx="5303520" cy="3182112"/>
                     </a:xfrm>
                     <a:prstGeom prst="rect"/>
                   </pic:spPr>
@@ -6047,7 +6103,7 @@
       <w:r>
         <w:drawing>
           <wp:inline xmlns:a="http://schemas.openxmlformats.org/drawingml/2006/main" xmlns:pic="http://schemas.openxmlformats.org/drawingml/2006/picture">
-            <wp:extent cx="5120640" cy="2304288"/>
+            <wp:extent cx="5303520" cy="2386584"/>
             <wp:docPr id="12" name="Picture 12"/>
             <wp:cNvGraphicFramePr>
               <a:graphicFrameLocks noChangeAspect="1"/>
@@ -6068,7 +6124,7 @@
                   <pic:spPr>
                     <a:xfrm>
                       <a:off x="0" y="0"/>
-                      <a:ext cx="5120640" cy="2304288"/>
+                      <a:ext cx="5303520" cy="2386584"/>
                     </a:xfrm>
                     <a:prstGeom prst="rect"/>
                   </pic:spPr>
@@ -6096,6 +6152,11 @@
       </w:r>
     </w:p>
     <w:p>
+      <w:r>
+        <w:br w:type="page"/>
+      </w:r>
+    </w:p>
+    <w:p>
       <w:pPr>
         <w:keepNext/>
         <w:spacing w:before="360" w:after="160"/>
@@ -6108,7 +6169,801 @@
           <w:color w:val="3B1E54"/>
           <w:sz w:val="32"/>
         </w:rPr>
-        <w:t>18. KEY FINDINGS</w:t>
+        <w:t>18. INTERACTIVE WEB DASHBOARD &amp; USER INTERFACE OUTPUTS</w:t>
+      </w:r>
+    </w:p>
+    <w:p>
+      <w:pPr>
+        <w:spacing w:after="120" w:line="276" w:lineRule="auto"/>
+      </w:pPr>
+      <w:r>
+        <w:rPr>
+          <w:rFonts w:ascii="Arial" w:hAnsi="Arial"/>
+          <w:b w:val="0"/>
+          <w:i w:val="0"/>
+          <w:color w:val="1F1A24"/>
+          <w:sz w:val="21"/>
+        </w:rPr>
+        <w:t>To deliver maximum practical utility to stakeholders, this capstone project features a standalone, interactive Web Analytics Dashboard (customer_sentiment_dashboard.html). Engineered to be 100% self-contained and offline-resilient, the user interface requires no external CDNs, API tokens, or server-side runtimes. It renders flawlessly in any modern web browser using client-side vanilla JavaScript and pure CSS custom properties.</w:t>
+      </w:r>
+    </w:p>
+    <w:p>
+      <w:pPr>
+        <w:keepNext/>
+        <w:spacing w:before="280" w:after="100"/>
+      </w:pPr>
+      <w:r>
+        <w:rPr>
+          <w:rFonts w:ascii="Arial" w:hAnsi="Arial"/>
+          <w:b/>
+          <w:i w:val="0"/>
+          <w:color w:val="7B2CBF"/>
+          <w:sz w:val="26"/>
+        </w:rPr>
+        <w:t>18.1 UI Architecture &amp; White + Purple Visual Identity</w:t>
+      </w:r>
+    </w:p>
+    <w:p>
+      <w:pPr>
+        <w:spacing w:after="120" w:line="276" w:lineRule="auto"/>
+      </w:pPr>
+      <w:r>
+        <w:rPr>
+          <w:rFonts w:ascii="Arial" w:hAnsi="Arial"/>
+          <w:b w:val="0"/>
+          <w:i w:val="0"/>
+          <w:color w:val="1F1A24"/>
+          <w:sz w:val="21"/>
+        </w:rPr>
+        <w:t>The user interface embodies an executive design language harmonized with the project's analytical color palette:</w:t>
+      </w:r>
+    </w:p>
+    <w:p>
+      <w:pPr>
+        <w:pStyle w:val="ListBullet"/>
+        <w:spacing w:after="80" w:line="276" w:lineRule="auto"/>
+      </w:pPr>
+      <w:r>
+        <w:rPr>
+          <w:rFonts w:ascii="Arial" w:hAnsi="Arial"/>
+          <w:b/>
+          <w:i w:val="0"/>
+          <w:color w:val="7B2CBF"/>
+          <w:sz w:val="21"/>
+        </w:rPr>
+        <w:t xml:space="preserve">Clean Minimalist Base: </w:t>
+      </w:r>
+      <w:r>
+        <w:rPr>
+          <w:rFonts w:ascii="Arial" w:hAnsi="Arial"/>
+          <w:b w:val="0"/>
+          <w:i w:val="0"/>
+          <w:color w:val="1F1A24"/>
+          <w:sz w:val="21"/>
+        </w:rPr>
+        <w:t>Pure white background (#FFFFFF) paired with soft lavender card backgrounds (#F8F5FF) and lilac structural borders (#D8B4FE), creating a high-contrast, clutter-free reading environment.</w:t>
+      </w:r>
+    </w:p>
+    <w:p>
+      <w:pPr>
+        <w:pStyle w:val="ListBullet"/>
+        <w:spacing w:after="80" w:line="276" w:lineRule="auto"/>
+      </w:pPr>
+      <w:r>
+        <w:rPr>
+          <w:rFonts w:ascii="Arial" w:hAnsi="Arial"/>
+          <w:b/>
+          <w:i w:val="0"/>
+          <w:color w:val="7B2CBF"/>
+          <w:sz w:val="21"/>
+        </w:rPr>
+        <w:t xml:space="preserve">Color Hierarchy: </w:t>
+      </w:r>
+      <w:r>
+        <w:rPr>
+          <w:rFonts w:ascii="Arial" w:hAnsi="Arial"/>
+          <w:b w:val="0"/>
+          <w:i w:val="0"/>
+          <w:color w:val="1F1A24"/>
+          <w:sz w:val="21"/>
+        </w:rPr>
+        <w:t>Deep Imperial Purple (#3B1E54) for executive headers, Electric Violet (#7B2CBF) for positive sentiment highlights and primary actions, Soft Lilac (#BDB2FF) for neutral cohorts, and Deep Magenta Plum (#9A348E) for critical negative alerts.</w:t>
+      </w:r>
+    </w:p>
+    <w:p>
+      <w:pPr>
+        <w:pStyle w:val="ListBullet"/>
+        <w:spacing w:after="80" w:line="276" w:lineRule="auto"/>
+      </w:pPr>
+      <w:r>
+        <w:rPr>
+          <w:rFonts w:ascii="Arial" w:hAnsi="Arial"/>
+          <w:b/>
+          <w:i w:val="0"/>
+          <w:color w:val="7B2CBF"/>
+          <w:sz w:val="21"/>
+        </w:rPr>
+        <w:t xml:space="preserve">Responsive Accessibility: </w:t>
+      </w:r>
+      <w:r>
+        <w:rPr>
+          <w:rFonts w:ascii="Arial" w:hAnsi="Arial"/>
+          <w:b w:val="0"/>
+          <w:i w:val="0"/>
+          <w:color w:val="1F1A24"/>
+          <w:sz w:val="21"/>
+        </w:rPr>
+        <w:t>Fully responsive CSS grid layout spanning from mobile viewports up to 4K displays, with subtle box shadows and hover micro-interactions.</w:t>
+      </w:r>
+    </w:p>
+    <w:p>
+      <w:pPr>
+        <w:pStyle w:val="ListBullet"/>
+        <w:spacing w:after="80" w:line="276" w:lineRule="auto"/>
+      </w:pPr>
+      <w:r>
+        <w:rPr>
+          <w:rFonts w:ascii="Arial" w:hAnsi="Arial"/>
+          <w:b/>
+          <w:i w:val="0"/>
+          <w:color w:val="7B2CBF"/>
+          <w:sz w:val="21"/>
+        </w:rPr>
+        <w:t xml:space="preserve">Author Verification: </w:t>
+      </w:r>
+      <w:r>
+        <w:rPr>
+          <w:rFonts w:ascii="Arial" w:hAnsi="Arial"/>
+          <w:b w:val="0"/>
+          <w:i w:val="0"/>
+          <w:color w:val="1F1A24"/>
+          <w:sz w:val="21"/>
+        </w:rPr>
+        <w:t>Prominent professional attribution 'Created by Harshita Tomer' positioned in both the executive header banner and the bottom footer.</w:t>
+      </w:r>
+    </w:p>
+    <w:p>
+      <w:pPr>
+        <w:keepNext/>
+        <w:spacing w:before="280" w:after="100"/>
+      </w:pPr>
+      <w:r>
+        <w:rPr>
+          <w:rFonts w:ascii="Arial" w:hAnsi="Arial"/>
+          <w:b/>
+          <w:i w:val="0"/>
+          <w:color w:val="7B2CBF"/>
+          <w:sz w:val="26"/>
+        </w:rPr>
+        <w:t>18.2 UI Output: Executive Header Banner &amp; KPI Summary Cards</w:t>
+      </w:r>
+    </w:p>
+    <w:p>
+      <w:pPr>
+        <w:spacing w:after="120" w:line="276" w:lineRule="auto"/>
+      </w:pPr>
+      <w:r>
+        <w:rPr>
+          <w:rFonts w:ascii="Arial" w:hAnsi="Arial"/>
+          <w:b w:val="0"/>
+          <w:i w:val="0"/>
+          <w:color w:val="1F1A24"/>
+          <w:sz w:val="21"/>
+        </w:rPr>
+        <w:t>The top of the dashboard delivers immediate executive visibility through an authoritative header banner and six Key Performance Indicator (KPI) cards. The header presents the project title, subtitle, author credit ('Created by Harshita Tomer'), and verified review count (2,435 across 16 variations). The KPI cards summarize total sample volume, average star rating (4.44 / 5), positive share (81.5%), neutral share (11.1%), negative share (7.4%), and dominant emotion (Joy at 62.4%).</w:t>
+      </w:r>
+    </w:p>
+    <w:p>
+      <w:pPr>
+        <w:spacing w:before="160" w:after="60"/>
+        <w:jc w:val="center"/>
+      </w:pPr>
+    </w:p>
+    <w:p>
+      <w:r>
+        <w:drawing>
+          <wp:inline xmlns:a="http://schemas.openxmlformats.org/drawingml/2006/main" xmlns:pic="http://schemas.openxmlformats.org/drawingml/2006/picture">
+            <wp:extent cx="5760720" cy="1361879"/>
+            <wp:docPr id="13" name="Picture 13"/>
+            <wp:cNvGraphicFramePr>
+              <a:graphicFrameLocks noChangeAspect="1"/>
+            </wp:cNvGraphicFramePr>
+            <a:graphic>
+              <a:graphicData uri="http://schemas.openxmlformats.org/drawingml/2006/picture">
+                <pic:pic>
+                  <pic:nvPicPr>
+                    <pic:cNvPr id="0" name="14_ui_dashboard_header_kpis.png"/>
+                    <pic:cNvPicPr/>
+                  </pic:nvPicPr>
+                  <pic:blipFill>
+                    <a:blip r:embed="rId23"/>
+                    <a:stretch>
+                      <a:fillRect/>
+                    </a:stretch>
+                  </pic:blipFill>
+                  <pic:spPr>
+                    <a:xfrm>
+                      <a:off x="0" y="0"/>
+                      <a:ext cx="5760720" cy="1361879"/>
+                    </a:xfrm>
+                    <a:prstGeom prst="rect"/>
+                  </pic:spPr>
+                </pic:pic>
+              </a:graphicData>
+            </a:graphic>
+          </wp:inline>
+        </w:drawing>
+      </w:r>
+    </w:p>
+    <w:p>
+      <w:pPr>
+        <w:spacing w:after="240"/>
+        <w:jc w:val="center"/>
+      </w:pPr>
+      <w:r>
+        <w:rPr>
+          <w:rFonts w:ascii="Arial" w:hAnsi="Arial"/>
+          <w:b w:val="0"/>
+          <w:i/>
+          <w:color w:val="5E548E"/>
+          <w:sz w:val="19"/>
+        </w:rPr>
+        <w:t>Figure 13: Executive Header Banner, Author Attribution &amp; KPI Summary Cards UI Output</w:t>
+      </w:r>
+    </w:p>
+    <w:p>
+      <w:pPr>
+        <w:keepNext/>
+        <w:spacing w:before="280" w:after="100"/>
+      </w:pPr>
+      <w:r>
+        <w:rPr>
+          <w:rFonts w:ascii="Arial" w:hAnsi="Arial"/>
+          <w:b/>
+          <w:i w:val="0"/>
+          <w:color w:val="7B2CBF"/>
+          <w:sz w:val="26"/>
+        </w:rPr>
+        <w:t>18.3 UI Output: Sentiment Overview &amp; Emotion Intelligence Spectrum</w:t>
+      </w:r>
+    </w:p>
+    <w:p>
+      <w:pPr>
+        <w:spacing w:after="120" w:line="276" w:lineRule="auto"/>
+      </w:pPr>
+      <w:r>
+        <w:rPr>
+          <w:rFonts w:ascii="Arial" w:hAnsi="Arial"/>
+          <w:b w:val="0"/>
+          <w:i w:val="0"/>
+          <w:color w:val="1F1A24"/>
+          <w:sz w:val="21"/>
+        </w:rPr>
+        <w:t>The primary analytical row pairs the VADER Sentiment Overview with the Psychological Emotion Insights spectrum. Progress bars visually illustrate the 81.5% positive, 11.1% neutral, and 7.4% negative breakdown, along with the executive 11.1 : 1 positive-to-negative ratio. The Emotion grid categorizes customer sentiment into Joy (62.4%), Neutral/Other (32.3%), Fear/Worry (2.0%), Sadness (1.8%), and Anger/Frustration (1.4%), complete with contextual driver descriptions.</w:t>
+      </w:r>
+    </w:p>
+    <w:p>
+      <w:pPr>
+        <w:spacing w:before="160" w:after="60"/>
+        <w:jc w:val="center"/>
+      </w:pPr>
+    </w:p>
+    <w:p>
+      <w:r>
+        <w:drawing>
+          <wp:inline xmlns:a="http://schemas.openxmlformats.org/drawingml/2006/main" xmlns:pic="http://schemas.openxmlformats.org/drawingml/2006/picture">
+            <wp:extent cx="5760720" cy="1571614"/>
+            <wp:docPr id="14" name="Picture 14"/>
+            <wp:cNvGraphicFramePr>
+              <a:graphicFrameLocks noChangeAspect="1"/>
+            </wp:cNvGraphicFramePr>
+            <a:graphic>
+              <a:graphicData uri="http://schemas.openxmlformats.org/drawingml/2006/picture">
+                <pic:pic>
+                  <pic:nvPicPr>
+                    <pic:cNvPr id="0" name="15_ui_dashboard_sentiment_emotions.png"/>
+                    <pic:cNvPicPr/>
+                  </pic:nvPicPr>
+                  <pic:blipFill>
+                    <a:blip r:embed="rId24"/>
+                    <a:stretch>
+                      <a:fillRect/>
+                    </a:stretch>
+                  </pic:blipFill>
+                  <pic:spPr>
+                    <a:xfrm>
+                      <a:off x="0" y="0"/>
+                      <a:ext cx="5760720" cy="1571614"/>
+                    </a:xfrm>
+                    <a:prstGeom prst="rect"/>
+                  </pic:spPr>
+                </pic:pic>
+              </a:graphicData>
+            </a:graphic>
+          </wp:inline>
+        </w:drawing>
+      </w:r>
+    </w:p>
+    <w:p>
+      <w:pPr>
+        <w:spacing w:after="240"/>
+        <w:jc w:val="center"/>
+      </w:pPr>
+      <w:r>
+        <w:rPr>
+          <w:rFonts w:ascii="Arial" w:hAnsi="Arial"/>
+          <w:b w:val="0"/>
+          <w:i/>
+          <w:color w:val="5E548E"/>
+          <w:sz w:val="19"/>
+        </w:rPr>
+        <w:t>Figure 14: VADER Sentiment Progress Meters &amp; Emotion Insights Spectrum UI Output</w:t>
+      </w:r>
+    </w:p>
+    <w:p>
+      <w:pPr>
+        <w:keepNext/>
+        <w:spacing w:before="280" w:after="100"/>
+      </w:pPr>
+      <w:r>
+        <w:rPr>
+          <w:rFonts w:ascii="Arial" w:hAnsi="Arial"/>
+          <w:b/>
+          <w:i w:val="0"/>
+          <w:color w:val="7B2CBF"/>
+          <w:sz w:val="26"/>
+        </w:rPr>
+        <w:t>18.4 UI Output: Star Rating Breakdown &amp; Qualitative Customer Feedback</w:t>
+      </w:r>
+    </w:p>
+    <w:p>
+      <w:pPr>
+        <w:spacing w:after="120" w:line="276" w:lineRule="auto"/>
+      </w:pPr>
+      <w:r>
+        <w:rPr>
+          <w:rFonts w:ascii="Arial" w:hAnsi="Arial"/>
+          <w:b w:val="0"/>
+          <w:i w:val="0"/>
+          <w:color w:val="1F1A24"/>
+          <w:sz w:val="21"/>
+        </w:rPr>
+        <w:t>This dashboard module contrasts quantitative star distributions (72.1% 5-star down to 5.8% 1-star) against qualitative linguistic metrics. KPI callouts reveal that satisfied reviews average 20.1 words of concise praise, while negative reviews average 38.6 words of detailed diagnostic critique. Real customer quotes illustrate these divergent feedback modalities.</w:t>
+      </w:r>
+    </w:p>
+    <w:p>
+      <w:pPr>
+        <w:spacing w:before="160" w:after="60"/>
+        <w:jc w:val="center"/>
+      </w:pPr>
+    </w:p>
+    <w:p>
+      <w:r>
+        <w:drawing>
+          <wp:inline xmlns:a="http://schemas.openxmlformats.org/drawingml/2006/main" xmlns:pic="http://schemas.openxmlformats.org/drawingml/2006/picture">
+            <wp:extent cx="5760720" cy="1496109"/>
+            <wp:docPr id="15" name="Picture 15"/>
+            <wp:cNvGraphicFramePr>
+              <a:graphicFrameLocks noChangeAspect="1"/>
+            </wp:cNvGraphicFramePr>
+            <a:graphic>
+              <a:graphicData uri="http://schemas.openxmlformats.org/drawingml/2006/picture">
+                <pic:pic>
+                  <pic:nvPicPr>
+                    <pic:cNvPr id="0" name="16_ui_dashboard_ratings_feedback.png"/>
+                    <pic:cNvPicPr/>
+                  </pic:nvPicPr>
+                  <pic:blipFill>
+                    <a:blip r:embed="rId25"/>
+                    <a:stretch>
+                      <a:fillRect/>
+                    </a:stretch>
+                  </pic:blipFill>
+                  <pic:spPr>
+                    <a:xfrm>
+                      <a:off x="0" y="0"/>
+                      <a:ext cx="5760720" cy="1496109"/>
+                    </a:xfrm>
+                    <a:prstGeom prst="rect"/>
+                  </pic:spPr>
+                </pic:pic>
+              </a:graphicData>
+            </a:graphic>
+          </wp:inline>
+        </w:drawing>
+      </w:r>
+    </w:p>
+    <w:p>
+      <w:pPr>
+        <w:spacing w:after="240"/>
+        <w:jc w:val="center"/>
+      </w:pPr>
+      <w:r>
+        <w:rPr>
+          <w:rFonts w:ascii="Arial" w:hAnsi="Arial"/>
+          <w:b w:val="0"/>
+          <w:i/>
+          <w:color w:val="5E548E"/>
+          <w:sz w:val="19"/>
+        </w:rPr>
+        <w:t>Figure 15: Star Rating Breakdown &amp; Customer Feedback Length Comparison UI Output</w:t>
+      </w:r>
+    </w:p>
+    <w:p>
+      <w:pPr>
+        <w:keepNext/>
+        <w:spacing w:before="280" w:after="100"/>
+      </w:pPr>
+      <w:r>
+        <w:rPr>
+          <w:rFonts w:ascii="Arial" w:hAnsi="Arial"/>
+          <w:b/>
+          <w:i w:val="0"/>
+          <w:color w:val="7B2CBF"/>
+          <w:sz w:val="26"/>
+        </w:rPr>
+        <w:t>18.5 UI Output: Keywords &amp; Frequency Dynamics (Lexical Tag Cloud)</w:t>
+      </w:r>
+    </w:p>
+    <w:p>
+      <w:pPr>
+        <w:spacing w:after="120" w:line="276" w:lineRule="auto"/>
+      </w:pPr>
+      <w:r>
+        <w:rPr>
+          <w:rFonts w:ascii="Arial" w:hAnsi="Arial"/>
+          <w:b w:val="0"/>
+          <w:i w:val="0"/>
+          <w:color w:val="1F1A24"/>
+          <w:sz w:val="21"/>
+        </w:rPr>
+        <w:t>The Lexical Mining module presents interactive tag pills highlighting the top 10 praise terms (e.g., 'love' with 736 occurrences, 'great' with 555) versus the top 10 friction terms (e.g., 'alarm' with 30 occurrences, 'screen' with 28, 'reset' with 17). Color-coded borders allow immediate visual differentiation between satisfaction drivers and pain points.</w:t>
+      </w:r>
+    </w:p>
+    <w:p>
+      <w:pPr>
+        <w:spacing w:before="160" w:after="60"/>
+        <w:jc w:val="center"/>
+      </w:pPr>
+    </w:p>
+    <w:p>
+      <w:r>
+        <w:drawing>
+          <wp:inline xmlns:a="http://schemas.openxmlformats.org/drawingml/2006/main" xmlns:pic="http://schemas.openxmlformats.org/drawingml/2006/picture">
+            <wp:extent cx="5760720" cy="900462"/>
+            <wp:docPr id="16" name="Picture 16"/>
+            <wp:cNvGraphicFramePr>
+              <a:graphicFrameLocks noChangeAspect="1"/>
+            </wp:cNvGraphicFramePr>
+            <a:graphic>
+              <a:graphicData uri="http://schemas.openxmlformats.org/drawingml/2006/picture">
+                <pic:pic>
+                  <pic:nvPicPr>
+                    <pic:cNvPr id="0" name="17_ui_dashboard_keywords.png"/>
+                    <pic:cNvPicPr/>
+                  </pic:nvPicPr>
+                  <pic:blipFill>
+                    <a:blip r:embed="rId26"/>
+                    <a:stretch>
+                      <a:fillRect/>
+                    </a:stretch>
+                  </pic:blipFill>
+                  <pic:spPr>
+                    <a:xfrm>
+                      <a:off x="0" y="0"/>
+                      <a:ext cx="5760720" cy="900462"/>
+                    </a:xfrm>
+                    <a:prstGeom prst="rect"/>
+                  </pic:spPr>
+                </pic:pic>
+              </a:graphicData>
+            </a:graphic>
+          </wp:inline>
+        </w:drawing>
+      </w:r>
+    </w:p>
+    <w:p>
+      <w:pPr>
+        <w:spacing w:after="240"/>
+        <w:jc w:val="center"/>
+      </w:pPr>
+      <w:r>
+        <w:rPr>
+          <w:rFonts w:ascii="Arial" w:hAnsi="Arial"/>
+          <w:b w:val="0"/>
+          <w:i/>
+          <w:color w:val="5E548E"/>
+          <w:sz w:val="19"/>
+        </w:rPr>
+        <w:t>Figure 16: Keyword Frequency Dynamics &amp; Lexical Mining Tags UI Output</w:t>
+      </w:r>
+    </w:p>
+    <w:p>
+      <w:pPr>
+        <w:keepNext/>
+        <w:spacing w:before="280" w:after="100"/>
+      </w:pPr>
+      <w:r>
+        <w:rPr>
+          <w:rFonts w:ascii="Arial" w:hAnsi="Arial"/>
+          <w:b/>
+          <w:i w:val="0"/>
+          <w:color w:val="7B2CBF"/>
+          <w:sz w:val="26"/>
+        </w:rPr>
+        <w:t>18.6 UI Output: Hardware Variation Benchmarks &amp; Strategic Recommendations</w:t>
+      </w:r>
+    </w:p>
+    <w:p>
+      <w:pPr>
+        <w:spacing w:after="120" w:line="276" w:lineRule="auto"/>
+      </w:pPr>
+      <w:r>
+        <w:rPr>
+          <w:rFonts w:ascii="Arial" w:hAnsi="Arial"/>
+          <w:b w:val="0"/>
+          <w:i w:val="0"/>
+          <w:color w:val="1F1A24"/>
+          <w:sz w:val="21"/>
+        </w:rPr>
+        <w:t>The dashboard's decision-support panel embeds a tabular benchmark ranking top hardware finishes (Charcoal Fabric leading at 4.74/5 and 89.0% positive; Heather Gray Fabric at 4.70/5) against baseline models (Standard Black Plastic at 4.23/5 and 11.9% negative). Below the table, four structured recommendation cards outline key product roadmap priorities.</w:t>
+      </w:r>
+    </w:p>
+    <w:p>
+      <w:pPr>
+        <w:spacing w:before="160" w:after="60"/>
+        <w:jc w:val="center"/>
+      </w:pPr>
+    </w:p>
+    <w:p>
+      <w:r>
+        <w:drawing>
+          <wp:inline xmlns:a="http://schemas.openxmlformats.org/drawingml/2006/main" xmlns:pic="http://schemas.openxmlformats.org/drawingml/2006/picture">
+            <wp:extent cx="5760720" cy="2399368"/>
+            <wp:docPr id="17" name="Picture 17"/>
+            <wp:cNvGraphicFramePr>
+              <a:graphicFrameLocks noChangeAspect="1"/>
+            </wp:cNvGraphicFramePr>
+            <a:graphic>
+              <a:graphicData uri="http://schemas.openxmlformats.org/drawingml/2006/picture">
+                <pic:pic>
+                  <pic:nvPicPr>
+                    <pic:cNvPr id="0" name="18_ui_dashboard_recommendations.png"/>
+                    <pic:cNvPicPr/>
+                  </pic:nvPicPr>
+                  <pic:blipFill>
+                    <a:blip r:embed="rId27"/>
+                    <a:stretch>
+                      <a:fillRect/>
+                    </a:stretch>
+                  </pic:blipFill>
+                  <pic:spPr>
+                    <a:xfrm>
+                      <a:off x="0" y="0"/>
+                      <a:ext cx="5760720" cy="2399368"/>
+                    </a:xfrm>
+                    <a:prstGeom prst="rect"/>
+                  </pic:spPr>
+                </pic:pic>
+              </a:graphicData>
+            </a:graphic>
+          </wp:inline>
+        </w:drawing>
+      </w:r>
+    </w:p>
+    <w:p>
+      <w:pPr>
+        <w:spacing w:after="240"/>
+        <w:jc w:val="center"/>
+      </w:pPr>
+      <w:r>
+        <w:rPr>
+          <w:rFonts w:ascii="Arial" w:hAnsi="Arial"/>
+          <w:b w:val="0"/>
+          <w:i/>
+          <w:color w:val="5E548E"/>
+          <w:sz w:val="19"/>
+        </w:rPr>
+        <w:t>Figure 17: Hardware Benchmarks Table &amp; Strategic Recommendations UI Output</w:t>
+      </w:r>
+    </w:p>
+    <w:p>
+      <w:pPr>
+        <w:keepNext/>
+        <w:spacing w:before="280" w:after="100"/>
+      </w:pPr>
+      <w:r>
+        <w:rPr>
+          <w:rFonts w:ascii="Arial" w:hAnsi="Arial"/>
+          <w:b/>
+          <w:i w:val="0"/>
+          <w:color w:val="7B2CBF"/>
+          <w:sz w:val="26"/>
+        </w:rPr>
+        <w:t>18.7 UI Output: Interactive Live Sentiment &amp; Emotion Analyzer Widget</w:t>
+      </w:r>
+    </w:p>
+    <w:p>
+      <w:pPr>
+        <w:spacing w:after="120" w:line="276" w:lineRule="auto"/>
+      </w:pPr>
+      <w:r>
+        <w:rPr>
+          <w:rFonts w:ascii="Arial" w:hAnsi="Arial"/>
+          <w:b w:val="0"/>
+          <w:i w:val="0"/>
+          <w:color w:val="1F1A24"/>
+          <w:sz w:val="21"/>
+        </w:rPr>
+        <w:t>To enable interactive stakeholder testing, the dashboard incorporates an embedded client-side NLP analyzer tool. Users can input any custom review text or select pre-loaded sample scenarios (Audio Praise, WiFi Drop Complaint, or Factual Neutral). Upon clicking 'Analyze Review Sentiment', the offline engine instantly computes the predicted sentiment class, compound polarity score (-1.00 to +1.00), dominant psychological emotion, polarity spectrum visual meter, and individual lexical triggers.</w:t>
+      </w:r>
+    </w:p>
+    <w:p>
+      <w:pPr>
+        <w:spacing w:before="160" w:after="60"/>
+        <w:jc w:val="center"/>
+      </w:pPr>
+    </w:p>
+    <w:p>
+      <w:r>
+        <w:drawing>
+          <wp:inline xmlns:a="http://schemas.openxmlformats.org/drawingml/2006/main" xmlns:pic="http://schemas.openxmlformats.org/drawingml/2006/picture">
+            <wp:extent cx="5760720" cy="2413350"/>
+            <wp:docPr id="18" name="Picture 18"/>
+            <wp:cNvGraphicFramePr>
+              <a:graphicFrameLocks noChangeAspect="1"/>
+            </wp:cNvGraphicFramePr>
+            <a:graphic>
+              <a:graphicData uri="http://schemas.openxmlformats.org/drawingml/2006/picture">
+                <pic:pic>
+                  <pic:nvPicPr>
+                    <pic:cNvPr id="0" name="19_ui_dashboard_live_tester.png"/>
+                    <pic:cNvPicPr/>
+                  </pic:nvPicPr>
+                  <pic:blipFill>
+                    <a:blip r:embed="rId28"/>
+                    <a:stretch>
+                      <a:fillRect/>
+                    </a:stretch>
+                  </pic:blipFill>
+                  <pic:spPr>
+                    <a:xfrm>
+                      <a:off x="0" y="0"/>
+                      <a:ext cx="5760720" cy="2413350"/>
+                    </a:xfrm>
+                    <a:prstGeom prst="rect"/>
+                  </pic:spPr>
+                </pic:pic>
+              </a:graphicData>
+            </a:graphic>
+          </wp:inline>
+        </w:drawing>
+      </w:r>
+    </w:p>
+    <w:p>
+      <w:pPr>
+        <w:spacing w:after="240"/>
+        <w:jc w:val="center"/>
+      </w:pPr>
+      <w:r>
+        <w:rPr>
+          <w:rFonts w:ascii="Arial" w:hAnsi="Arial"/>
+          <w:b w:val="0"/>
+          <w:i/>
+          <w:color w:val="5E548E"/>
+          <w:sz w:val="19"/>
+        </w:rPr>
+        <w:t>Figure 18: Interactive Live Review Sentiment &amp; Emotion Analyzer Tool &amp; Creator Footer UI Output</w:t>
+      </w:r>
+    </w:p>
+    <w:p>
+      <w:pPr>
+        <w:keepNext/>
+        <w:spacing w:before="280" w:after="100"/>
+      </w:pPr>
+      <w:r>
+        <w:rPr>
+          <w:rFonts w:ascii="Arial" w:hAnsi="Arial"/>
+          <w:b/>
+          <w:i w:val="0"/>
+          <w:color w:val="7B2CBF"/>
+          <w:sz w:val="26"/>
+        </w:rPr>
+        <w:t>18.8 UI Output: End-to-End Single-Page Web Dashboard Overview</w:t>
+      </w:r>
+    </w:p>
+    <w:p>
+      <w:pPr>
+        <w:spacing w:after="120" w:line="276" w:lineRule="auto"/>
+      </w:pPr>
+      <w:r>
+        <w:rPr>
+          <w:rFonts w:ascii="Arial" w:hAnsi="Arial"/>
+          <w:b w:val="0"/>
+          <w:i w:val="0"/>
+          <w:color w:val="1F1A24"/>
+          <w:sz w:val="21"/>
+        </w:rPr>
+        <w:t>Figure 19 presents the consolidated, full-length visual architecture of the Customer Sentiment Analytics Dashboard. The unified White + Purple aesthetic ensures a cohesive visual identity across all analytical tiers, from high-level executive KPIs down to granular real-time text inference.</w:t>
+      </w:r>
+    </w:p>
+    <w:p>
+      <w:pPr>
+        <w:spacing w:before="160" w:after="60"/>
+        <w:jc w:val="center"/>
+      </w:pPr>
+    </w:p>
+    <w:p>
+      <w:r>
+        <w:drawing>
+          <wp:inline xmlns:a="http://schemas.openxmlformats.org/drawingml/2006/main" xmlns:pic="http://schemas.openxmlformats.org/drawingml/2006/picture">
+            <wp:extent cx="4389120" cy="7603628"/>
+            <wp:docPr id="19" name="Picture 19"/>
+            <wp:cNvGraphicFramePr>
+              <a:graphicFrameLocks noChangeAspect="1"/>
+            </wp:cNvGraphicFramePr>
+            <a:graphic>
+              <a:graphicData uri="http://schemas.openxmlformats.org/drawingml/2006/picture">
+                <pic:pic>
+                  <pic:nvPicPr>
+                    <pic:cNvPr id="0" name="13_ui_dashboard_full.png"/>
+                    <pic:cNvPicPr/>
+                  </pic:nvPicPr>
+                  <pic:blipFill>
+                    <a:blip r:embed="rId29"/>
+                    <a:stretch>
+                      <a:fillRect/>
+                    </a:stretch>
+                  </pic:blipFill>
+                  <pic:spPr>
+                    <a:xfrm>
+                      <a:off x="0" y="0"/>
+                      <a:ext cx="4389120" cy="7603628"/>
+                    </a:xfrm>
+                    <a:prstGeom prst="rect"/>
+                  </pic:spPr>
+                </pic:pic>
+              </a:graphicData>
+            </a:graphic>
+          </wp:inline>
+        </w:drawing>
+      </w:r>
+    </w:p>
+    <w:p>
+      <w:pPr>
+        <w:spacing w:after="240"/>
+        <w:jc w:val="center"/>
+      </w:pPr>
+      <w:r>
+        <w:rPr>
+          <w:rFonts w:ascii="Arial" w:hAnsi="Arial"/>
+          <w:b w:val="0"/>
+          <w:i/>
+          <w:color w:val="5E548E"/>
+          <w:sz w:val="19"/>
+        </w:rPr>
+        <w:t>Figure 19: Comprehensive Customer Sentiment Analytics Dashboard Full-Page UI Output</w:t>
+      </w:r>
+    </w:p>
+    <w:p>
+      <w:r>
+        <w:br w:type="page"/>
+      </w:r>
+    </w:p>
+    <w:p>
+      <w:pPr>
+        <w:keepNext/>
+        <w:spacing w:before="360" w:after="160"/>
+      </w:pPr>
+      <w:r>
+        <w:rPr>
+          <w:rFonts w:ascii="Arial" w:hAnsi="Arial"/>
+          <w:b/>
+          <w:i w:val="0"/>
+          <w:color w:val="3B1E54"/>
+          <w:sz w:val="32"/>
+        </w:rPr>
+        <w:t>19. KEY FINDINGS</w:t>
       </w:r>
     </w:p>
     <w:p>
@@ -6243,7 +7098,7 @@
           <w:color w:val="3B1E54"/>
           <w:sz w:val="32"/>
         </w:rPr>
-        <w:t>19. BUSINESS INSIGHTS</w:t>
+        <w:t>20. BUSINESS INSIGHTS</w:t>
       </w:r>
     </w:p>
     <w:p>
@@ -6352,7 +7207,7 @@
           <w:color w:val="3B1E54"/>
           <w:sz w:val="32"/>
         </w:rPr>
-        <w:t>20. BUSINESS RECOMMENDATIONS</w:t>
+        <w:t>21. BUSINESS RECOMMENDATIONS</w:t>
       </w:r>
     </w:p>
     <w:p>
@@ -6487,7 +7342,7 @@
           <w:color w:val="3B1E54"/>
           <w:sz w:val="32"/>
         </w:rPr>
-        <w:t>21. PROJECT LIMITATIONS</w:t>
+        <w:t>22. PROJECT LIMITATIONS</w:t>
       </w:r>
     </w:p>
     <w:p>
@@ -6596,7 +7451,7 @@
           <w:color w:val="3B1E54"/>
           <w:sz w:val="32"/>
         </w:rPr>
-        <w:t>22. FUTURE SCOPE</w:t>
+        <w:t>23. FUTURE SCOPE</w:t>
       </w:r>
     </w:p>
     <w:p>
@@ -6705,7 +7560,7 @@
           <w:color w:val="3B1E54"/>
           <w:sz w:val="32"/>
         </w:rPr>
-        <w:t>23. CONCLUSION</w:t>
+        <w:t>24. CONCLUSION</w:t>
       </w:r>
     </w:p>
     <w:p>
@@ -6735,7 +7590,7 @@
           <w:color w:val="1F1A24"/>
           <w:sz w:val="21"/>
         </w:rPr>
-        <w:t>By implementing VADER sentiment scoring, discrete emotion classification, keyword discovery, and 12 dashboard-style White + Purple visualizations, this research proves that computational linguistics can directly inform product roadmap decisions, quality assurance protocols, and brand positioning strategies.</w:t>
+        <w:t>By implementing VADER sentiment scoring, discrete emotion classification, keyword discovery, 12 dashboard-style White + Purple visualizations, and an offline interactive web analytics interface with live review testing, this research proves that computational linguistics can directly inform product roadmap decisions, quality assurance protocols, and brand positioning strategies.</w:t>
       </w:r>
     </w:p>
     <w:p>
@@ -6751,7 +7606,7 @@
           <w:color w:val="3B1E54"/>
           <w:sz w:val="32"/>
         </w:rPr>
-        <w:t>24. REFERENCES</w:t>
+        <w:t>25. REFERENCES</w:t>
       </w:r>
     </w:p>
     <w:p>
@@ -6988,7 +7843,7 @@
         <w:color w:val="3B1E54"/>
         <w:sz w:val="17"/>
       </w:rPr>
-      <w:t>Created by Harshita Tomer  •  White &amp; Purple Edition</w:t>
+      <w:t>Created by Harshita Tomer  •  Customer Sentiment Analytics Project Report</w:t>
     </w:r>
   </w:p>
 </w:ftr>
@@ -7007,7 +7862,7 @@
         <w:color w:val="5E548E"/>
         <w:sz w:val="17"/>
       </w:rPr>
-      <w:t>Customer Sentiment Analytics | NLP Project Report</w:t>
+      <w:t>Customer Sentiment Analytics | NLP Capstone Project Report</w:t>
     </w:r>
   </w:p>
 </w:hdr>

</xml_diff>